<commit_message>
Add optional VTH/IDSAT/IREV screening and refresh SIH docs.
Keep IDDQ, leakage, and tpd as the required live inputs. Optional extras
feed PAT and 168 h forecasts without changing Isolation Forest or the
HOLD/REJECT fuse. Retrain the frozen bundle (0 escapes, 75 REJECT / 27
HOLD on held-out lots) and regenerate the four Word deliverables.
</commit_message>
<xml_diff>
--- a/docs/AETHER_ML_Modelling_Desktop_and_Web_Catalogue.docx
+++ b/docs/AETHER_ML_Modelling_Desktop_and_Web_Catalogue.docx
@@ -3270,7 +3270,7 @@
                 <w:sz w:val="20"/>
                 <w:szCs w:val="20"/>
               </w:rPr>
-              <w:t xml:space="preserve">Standby current (IDDQ), Leakage current, Propagation delay</w:t>
+              <w:t xml:space="preserve">IDDQ, Leakage, tpd, plus VTH / IDSAT / reverse leakage when present</w:t>
             </w:r>
           </w:p>
         </w:tc>
@@ -3302,7 +3302,7 @@
                 <w:sz w:val="20"/>
                 <w:szCs w:val="20"/>
               </w:rPr>
-              <w:t xml:space="preserve">Selects the Lot board scatter axes and the QA inspector what-if slider. Time series always show all three parameters.</w:t>
+              <w:t xml:space="preserve">Selects the Lot board scatter axes and the QA inspector what-if slider. Time series show every parameter the lot has.</w:t>
             </w:r>
           </w:p>
         </w:tc>
@@ -4168,6 +4168,136 @@
                 <w:sz w:val="20"/>
                 <w:szCs w:val="20"/>
               </w:rPr>
+              <w:t xml:space="preserve">VTH / IDSAT / IREV MAE</w:t>
+            </w:r>
+          </w:p>
+        </w:tc>
+        <w:tc>
+          <w:tcPr>
+            <w:tcW w:type="dxa" w:w="1700"/>
+            <w:tcBorders>
+              <w:top w:val="single" w:color="C5D0DC" w:sz="4"/>
+              <w:left w:val="single" w:color="C5D0DC" w:sz="4"/>
+              <w:bottom w:val="single" w:color="C5D0DC" w:sz="4"/>
+              <w:right w:val="single" w:color="C5D0DC" w:sz="4"/>
+            </w:tcBorders>
+            <w:shd w:fill="FFFFFF" w:val="clear"/>
+            <w:tcMar>
+              <w:top w:type="dxa" w:w="70"/>
+              <w:left w:type="dxa" w:w="100"/>
+              <w:bottom w:type="dxa" w:w="70"/>
+              <w:right w:type="dxa" w:w="100"/>
+            </w:tcMar>
+            <w:vAlign w:val="center"/>
+          </w:tcPr>
+          <w:p>
+            <w:r>
+              <w:rPr>
+                <w:rFonts w:ascii="Arial" w:cs="Arial" w:eastAsia="Arial" w:hAnsi="Arial"/>
+                <w:b w:val="false"/>
+                <w:bCs w:val="false"/>
+                <w:color w:val="222222"/>
+                <w:sz w:val="20"/>
+                <w:szCs w:val="20"/>
+              </w:rPr>
+              <w:t xml:space="preserve">0.007 V / 0.20 mA / 0.10 µA</w:t>
+            </w:r>
+          </w:p>
+        </w:tc>
+        <w:tc>
+          <w:tcPr>
+            <w:tcW w:type="dxa" w:w="2813"/>
+            <w:tcBorders>
+              <w:top w:val="single" w:color="C5D0DC" w:sz="4"/>
+              <w:left w:val="single" w:color="C5D0DC" w:sz="4"/>
+              <w:bottom w:val="single" w:color="C5D0DC" w:sz="4"/>
+              <w:right w:val="single" w:color="C5D0DC" w:sz="4"/>
+            </w:tcBorders>
+            <w:shd w:fill="FFFFFF" w:val="clear"/>
+            <w:tcMar>
+              <w:top w:type="dxa" w:w="70"/>
+              <w:left w:type="dxa" w:w="100"/>
+              <w:bottom w:type="dxa" w:w="70"/>
+              <w:right w:type="dxa" w:w="100"/>
+            </w:tcMar>
+            <w:vAlign w:val="center"/>
+          </w:tcPr>
+          <w:p>
+            <w:r>
+              <w:rPr>
+                <w:rFonts w:ascii="Arial" w:cs="Arial" w:eastAsia="Arial" w:hAnsi="Arial"/>
+                <w:b w:val="false"/>
+                <w:bCs w:val="false"/>
+                <w:color w:val="222222"/>
+                <w:sz w:val="20"/>
+                <w:szCs w:val="20"/>
+              </w:rPr>
+              <w:t xml:space="preserve">Optional extras; same 0 h / 24 h → 168 h stack.</w:t>
+            </w:r>
+          </w:p>
+        </w:tc>
+        <w:tc>
+          <w:tcPr>
+            <w:tcW w:type="dxa" w:w="2813"/>
+            <w:tcBorders>
+              <w:top w:val="single" w:color="C5D0DC" w:sz="4"/>
+              <w:left w:val="single" w:color="C5D0DC" w:sz="4"/>
+              <w:bottom w:val="single" w:color="C5D0DC" w:sz="4"/>
+              <w:right w:val="single" w:color="C5D0DC" w:sz="4"/>
+            </w:tcBorders>
+            <w:shd w:fill="FFFFFF" w:val="clear"/>
+            <w:tcMar>
+              <w:top w:type="dxa" w:w="70"/>
+              <w:left w:type="dxa" w:w="100"/>
+              <w:bottom w:type="dxa" w:w="70"/>
+              <w:right w:type="dxa" w:w="100"/>
+            </w:tcMar>
+            <w:vAlign w:val="center"/>
+          </w:tcPr>
+          <w:p>
+            <w:r>
+              <w:rPr>
+                <w:rFonts w:ascii="Arial" w:cs="Arial" w:eastAsia="Arial" w:hAnsi="Arial"/>
+                <w:b w:val="false"/>
+                <w:bCs w:val="false"/>
+                <w:color w:val="222222"/>
+                <w:sz w:val="20"/>
+                <w:szCs w:val="20"/>
+              </w:rPr>
+              <w:t xml:space="preserve">Shown when the ATE log has those columns.</w:t>
+            </w:r>
+          </w:p>
+        </w:tc>
+      </w:tr>
+      <w:tr>
+        <w:tc>
+          <w:tcPr>
+            <w:tcW w:type="dxa" w:w="1700"/>
+            <w:tcBorders>
+              <w:top w:val="single" w:color="C5D0DC" w:sz="4"/>
+              <w:left w:val="single" w:color="C5D0DC" w:sz="4"/>
+              <w:bottom w:val="single" w:color="C5D0DC" w:sz="4"/>
+              <w:right w:val="single" w:color="C5D0DC" w:sz="4"/>
+            </w:tcBorders>
+            <w:shd w:fill="F7F9FC" w:val="clear"/>
+            <w:tcMar>
+              <w:top w:type="dxa" w:w="70"/>
+              <w:left w:type="dxa" w:w="100"/>
+              <w:bottom w:type="dxa" w:w="70"/>
+              <w:right w:type="dxa" w:w="100"/>
+            </w:tcMar>
+            <w:vAlign w:val="center"/>
+          </w:tcPr>
+          <w:p>
+            <w:r>
+              <w:rPr>
+                <w:rFonts w:ascii="Arial" w:cs="Arial" w:eastAsia="Arial" w:hAnsi="Arial"/>
+                <w:b w:val="false"/>
+                <w:bCs w:val="false"/>
+                <w:color w:val="222222"/>
+                <w:sz w:val="20"/>
+                <w:szCs w:val="20"/>
+              </w:rPr>
               <w:t xml:space="preserve">Chamber hours saved</w:t>
             </w:r>
           </w:p>
@@ -4181,26 +4311,26 @@
               <w:bottom w:val="single" w:color="C5D0DC" w:sz="4"/>
               <w:right w:val="single" w:color="C5D0DC" w:sz="4"/>
             </w:tcBorders>
-            <w:shd w:fill="FFFFFF" w:val="clear"/>
-            <w:tcMar>
-              <w:top w:type="dxa" w:w="70"/>
-              <w:left w:type="dxa" w:w="100"/>
-              <w:bottom w:type="dxa" w:w="70"/>
-              <w:right w:type="dxa" w:w="100"/>
-            </w:tcMar>
-            <w:vAlign w:val="center"/>
-          </w:tcPr>
-          <w:p>
-            <w:r>
-              <w:rPr>
-                <w:rFonts w:ascii="Arial" w:cs="Arial" w:eastAsia="Arial" w:hAnsi="Arial"/>
-                <w:b w:val="false"/>
-                <w:bCs w:val="false"/>
-                <w:color w:val="222222"/>
-                <w:sz w:val="20"/>
-                <w:szCs w:val="20"/>
-              </w:rPr>
-              <w:t xml:space="preserve">10,800</w:t>
+            <w:shd w:fill="F7F9FC" w:val="clear"/>
+            <w:tcMar>
+              <w:top w:type="dxa" w:w="70"/>
+              <w:left w:type="dxa" w:w="100"/>
+              <w:bottom w:type="dxa" w:w="70"/>
+              <w:right w:type="dxa" w:w="100"/>
+            </w:tcMar>
+            <w:vAlign w:val="center"/>
+          </w:tcPr>
+          <w:p>
+            <w:r>
+              <w:rPr>
+                <w:rFonts w:ascii="Arial" w:cs="Arial" w:eastAsia="Arial" w:hAnsi="Arial"/>
+                <w:b w:val="false"/>
+                <w:bCs w:val="false"/>
+                <w:color w:val="222222"/>
+                <w:sz w:val="20"/>
+                <w:szCs w:val="20"/>
+              </w:rPr>
+              <w:t xml:space="preserve">10,944</w:t>
             </w:r>
           </w:p>
         </w:tc>
@@ -4213,7 +4343,7 @@
               <w:bottom w:val="single" w:color="C5D0DC" w:sz="4"/>
               <w:right w:val="single" w:color="C5D0DC" w:sz="4"/>
             </w:tcBorders>
-            <w:shd w:fill="FFFFFF" w:val="clear"/>
+            <w:shd w:fill="F7F9FC" w:val="clear"/>
             <w:tcMar>
               <w:top w:type="dxa" w:w="70"/>
               <w:left w:type="dxa" w:w="100"/>
@@ -4245,7 +4375,7 @@
               <w:bottom w:val="single" w:color="C5D0DC" w:sz="4"/>
               <w:right w:val="single" w:color="C5D0DC" w:sz="4"/>
             </w:tcBorders>
-            <w:shd w:fill="FFFFFF" w:val="clear"/>
+            <w:shd w:fill="F7F9FC" w:val="clear"/>
             <w:tcMar>
               <w:top w:type="dxa" w:w="70"/>
               <w:left w:type="dxa" w:w="100"/>
@@ -8051,7 +8181,7 @@
           <w:sz w:val="22"/>
           <w:szCs w:val="22"/>
         </w:rPr>
-        <w:t xml:space="preserve">How to read it: the hole is the 24 h gate. A healthy screening line is a large green ring (finish burn-in), a thin amber wedge (96 h confirmation), and a small red wedge (pull now). On the held-out lots that the KPI strip refers to, the mix is 1,172 PASS (80.9%), 202 HOLD (13.9%), 75 REJECT (5.2%).</w:t>
+        <w:t xml:space="preserve">How to read it: the hole is the 24 h gate. A healthy screening line is a large green ring (finish burn-in), a thin amber wedge (96 h confirmation), and a small red wedge (pull now). On the held-out lots that the KPI strip refers to, the mix is 1,175 PASS (81.1%), 198 HOLD (13.7%), 76 REJECT (5.2%).</w:t>
       </w:r>
     </w:p>
     <w:p>
@@ -13439,7 +13569,7 @@
           <w:sz w:val="22"/>
           <w:szCs w:val="22"/>
         </w:rPr>
-        <w:t xml:space="preserve">144 h is 168 − 24. PASS and HOLD recover no chamber time, because those parts stay in the oven. That is why the KPI 'Chamber hours saved' is 10,800 = 144 × 75 on the test lots, not a claim that healthy flight silicon was pulled early.</w:t>
+        <w:t xml:space="preserve">144 h is 168 − 24. PASS and HOLD recover no chamber time, because those parts stay in the oven. That is why the KPI 'Chamber hours saved' is 10,944 = 144 × 76 on the test lots, not a claim that healthy flight silicon was pulled early.</w:t>
       </w:r>
     </w:p>
     <w:p>
@@ -16752,7 +16882,7 @@
                 <w:sz w:val="20"/>
                 <w:szCs w:val="20"/>
               </w:rPr>
-              <w:t xml:space="preserve">75 / 202 / 1172</w:t>
+              <w:t xml:space="preserve">76 / 198 / 1175</w:t>
             </w:r>
           </w:p>
         </w:tc>
@@ -16816,7 +16946,7 @@
                 <w:sz w:val="20"/>
                 <w:szCs w:val="20"/>
               </w:rPr>
-              <w:t xml:space="preserve">10,800</w:t>
+              <w:t xml:space="preserve">10,944</w:t>
             </w:r>
           </w:p>
         </w:tc>

</xml_diff>